<commit_message>
release: v2.2.2 defaults, activities UX, and generation improvements
</commit_message>
<xml_diff>
--- a/Models/2026-03_Statuts_Template.docx
+++ b/Models/2026-03_Statuts_Template.docx
@@ -1,6 +1,6 @@
 
 <file path=word/document.xml><?xml version="1.0" encoding="utf-8"?>
-<w:document xmlns:wpc="http://schemas.microsoft.com/office/word/2010/wordprocessingCanvas" xmlns:cx="http://schemas.microsoft.com/office/drawing/2014/chartex" xmlns:cx1="http://schemas.microsoft.com/office/drawing/2015/9/8/chartex" xmlns:cx2="http://schemas.microsoft.com/office/drawing/2015/10/21/chartex" xmlns:cx3="http://schemas.microsoft.com/office/drawing/2016/5/9/chartex" xmlns:cx4="http://schemas.microsoft.com/office/drawing/2016/5/10/chartex" xmlns:cx5="http://schemas.microsoft.com/office/drawing/2016/5/11/chartex" xmlns:cx6="http://schemas.microsoft.com/office/drawing/2016/5/12/chartex" xmlns:cx7="http://schemas.microsoft.com/office/drawing/2016/5/13/chartex" xmlns:cx8="http://schemas.microsoft.com/office/drawing/2016/5/14/chartex" xmlns:mc="http://schemas.openxmlformats.org/markup-compatibility/2006" xmlns:aink="http://schemas.microsoft.com/office/drawing/2016/ink" xmlns:am3d="http://schemas.microsoft.com/office/drawing/2017/model3d" xmlns:o="urn:schemas-microsoft-com:office:office" xmlns:oel="http://schemas.microsoft.com/office/2019/extlst" xmlns:r="http://schemas.openxmlformats.org/officeDocument/2006/relationships" xmlns:m="http://schemas.openxmlformats.org/officeDocument/2006/math" xmlns:v="urn:schemas-microsoft-com:vml" xmlns:wp14="http://schemas.microsoft.com/office/word/2010/wordprocessingDrawing" xmlns:wp="http://schemas.openxmlformats.org/drawingml/2006/wordprocessingDrawing" xmlns:w10="urn:schemas-microsoft-com:office:word" xmlns:w="http://schemas.openxmlformats.org/wordprocessingml/2006/main" xmlns:w14="http://schemas.microsoft.com/office/word/2010/wordml" xmlns:w15="http://schemas.microsoft.com/office/word/2012/wordml" xmlns:w16cex="http://schemas.microsoft.com/office/word/2018/wordml/cex" xmlns:w16cid="http://schemas.microsoft.com/office/word/2016/wordml/cid" xmlns:w16="http://schemas.microsoft.com/office/word/2018/wordml" xmlns:w16sdtdh="http://schemas.microsoft.com/office/word/2020/wordml/sdtdatahash" xmlns:w16se="http://schemas.microsoft.com/office/word/2015/wordml/symex" xmlns:wpg="http://schemas.microsoft.com/office/word/2010/wordprocessingGroup" xmlns:wpi="http://schemas.microsoft.com/office/word/2010/wordprocessingInk" xmlns:wne="http://schemas.microsoft.com/office/word/2006/wordml" xmlns:wps="http://schemas.microsoft.com/office/word/2010/wordprocessingShape" mc:Ignorable="w14 w15 w16se w16cid w16 w16cex w16sdtdh wp14">
+<w:document xmlns:wpc="http://schemas.microsoft.com/office/word/2010/wordprocessingCanvas" xmlns:cx="http://schemas.microsoft.com/office/drawing/2014/chartex" xmlns:cx1="http://schemas.microsoft.com/office/drawing/2015/9/8/chartex" xmlns:cx2="http://schemas.microsoft.com/office/drawing/2015/10/21/chartex" xmlns:cx3="http://schemas.microsoft.com/office/drawing/2016/5/9/chartex" xmlns:cx4="http://schemas.microsoft.com/office/drawing/2016/5/10/chartex" xmlns:cx5="http://schemas.microsoft.com/office/drawing/2016/5/11/chartex" xmlns:cx6="http://schemas.microsoft.com/office/drawing/2016/5/12/chartex" xmlns:cx7="http://schemas.microsoft.com/office/drawing/2016/5/13/chartex" xmlns:cx8="http://schemas.microsoft.com/office/drawing/2016/5/14/chartex" xmlns:mc="http://schemas.openxmlformats.org/markup-compatibility/2006" xmlns:aink="http://schemas.microsoft.com/office/drawing/2016/ink" xmlns:am3d="http://schemas.microsoft.com/office/drawing/2017/model3d" xmlns:o="urn:schemas-microsoft-com:office:office" xmlns:oel="http://schemas.microsoft.com/office/2019/extlst" xmlns:r="http://schemas.openxmlformats.org/officeDocument/2006/relationships" xmlns:m="http://schemas.openxmlformats.org/officeDocument/2006/math" xmlns:v="urn:schemas-microsoft-com:vml" xmlns:wp14="http://schemas.microsoft.com/office/word/2010/wordprocessingDrawing" xmlns:wp="http://schemas.openxmlformats.org/drawingml/2006/wordprocessingDrawing" xmlns:w10="urn:schemas-microsoft-com:office:word" xmlns:w="http://schemas.openxmlformats.org/wordprocessingml/2006/main" xmlns:w14="http://schemas.microsoft.com/office/word/2010/wordml" xmlns:w15="http://schemas.microsoft.com/office/word/2012/wordml" xmlns:w16cex="http://schemas.microsoft.com/office/word/2018/wordml/cex" xmlns:w16cid="http://schemas.microsoft.com/office/word/2016/wordml/cid" xmlns:w16="http://schemas.microsoft.com/office/word/2018/wordml" xmlns:w16du="http://schemas.microsoft.com/office/word/2023/wordml/word16du" xmlns:w16sdtdh="http://schemas.microsoft.com/office/word/2020/wordml/sdtdatahash" xmlns:w16sdtfl="http://schemas.microsoft.com/office/word/2024/wordml/sdtformatlock" xmlns:w16se="http://schemas.microsoft.com/office/word/2015/wordml/symex" xmlns:wpg="http://schemas.microsoft.com/office/word/2010/wordprocessingGroup" xmlns:wpi="http://schemas.microsoft.com/office/word/2010/wordprocessingInk" xmlns:wne="http://schemas.microsoft.com/office/word/2006/wordml" xmlns:wps="http://schemas.microsoft.com/office/word/2010/wordprocessingShape" mc:Ignorable="w14 w15 w16se w16cid w16 w16cex w16sdtdh w16sdtfl w16du wp14">
   <w:body>
     <w:p>
       <w:pPr>
@@ -1135,6 +1135,38 @@
     </w:p>
     <w:p>
       <w:pPr>
+        <w:spacing w:after="0"/>
+        <w:rPr>
+          <w:rFonts w:ascii="Aptos" w:hAnsi="Aptos" w:cs="Times New Roman"/>
+          <w:b/>
+          <w:bCs/>
+          <w:lang w:val="en-US"/>
+        </w:rPr>
+      </w:pPr>
+      <w:bookmarkStart w:id="9" w:name="_Hlk131759399"/>
+      <w:r>
+        <w:rPr>
+          <w:rFonts w:ascii="Aptos" w:hAnsi="Aptos" w:cs="Times New Roman"/>
+          <w:b/>
+          <w:bCs/>
+          <w:lang w:val="en-US"/>
+        </w:rPr>
+        <w:t>{%p for a in ACTIVITES_</w:t>
+      </w:r>
+      <w:proofErr w:type="gramStart"/>
+      <w:r>
+        <w:rPr>
+          <w:rFonts w:ascii="Aptos" w:hAnsi="Aptos" w:cs="Times New Roman"/>
+          <w:b/>
+          <w:bCs/>
+          <w:lang w:val="en-US"/>
+        </w:rPr>
+        <w:t>LIST %}</w:t>
+      </w:r>
+      <w:proofErr w:type="gramEnd"/>
+    </w:p>
+    <w:p>
+      <w:pPr>
         <w:pStyle w:val="Paragraphedeliste"/>
         <w:numPr>
           <w:ilvl w:val="0"/>
@@ -1147,31 +1179,27 @@
           <w:bCs/>
         </w:rPr>
       </w:pPr>
-      <w:bookmarkStart w:id="9" w:name="_Hlk131759399"/>
+      <w:proofErr w:type="gramStart"/>
       <w:r>
         <w:rPr>
           <w:rFonts w:ascii="Aptos" w:hAnsi="Aptos" w:cs="Times New Roman"/>
           <w:b/>
           <w:bCs/>
         </w:rPr>
-        <w:t>{{ACTIVITY1}}</w:t>
-      </w:r>
+        <w:t>{{ a</w:t>
+      </w:r>
+      <w:proofErr w:type="gramEnd"/>
       <w:r>
         <w:rPr>
           <w:rFonts w:ascii="Aptos" w:hAnsi="Aptos" w:cs="Times New Roman"/>
           <w:b/>
           <w:bCs/>
         </w:rPr>
-        <w:t xml:space="preserve">. </w:t>
-      </w:r>
-    </w:p>
-    <w:p>
-      <w:pPr>
-        <w:pStyle w:val="Paragraphedeliste"/>
-        <w:numPr>
-          <w:ilvl w:val="0"/>
-          <w:numId w:val="20"/>
-        </w:numPr>
+        <w:t xml:space="preserve"> }}</w:t>
+      </w:r>
+    </w:p>
+    <w:p>
+      <w:pPr>
         <w:spacing w:after="0"/>
         <w:rPr>
           <w:rFonts w:ascii="Aptos" w:hAnsi="Aptos" w:cs="Times New Roman"/>
@@ -1185,219 +1213,25 @@
           <w:b/>
           <w:bCs/>
         </w:rPr>
-        <w:t>{{ACTIVITY</w:t>
-      </w:r>
+        <w:t xml:space="preserve">{%p </w:t>
+      </w:r>
+      <w:proofErr w:type="spellStart"/>
       <w:r>
         <w:rPr>
           <w:rFonts w:ascii="Aptos" w:hAnsi="Aptos" w:cs="Times New Roman"/>
           <w:b/>
           <w:bCs/>
         </w:rPr>
-        <w:t>2</w:t>
-      </w:r>
+        <w:t>endfor</w:t>
+      </w:r>
+      <w:proofErr w:type="spellEnd"/>
       <w:r>
         <w:rPr>
           <w:rFonts w:ascii="Aptos" w:hAnsi="Aptos" w:cs="Times New Roman"/>
           <w:b/>
           <w:bCs/>
         </w:rPr>
-        <w:t>}}</w:t>
-      </w:r>
-      <w:r>
-        <w:rPr>
-          <w:rFonts w:ascii="Aptos" w:hAnsi="Aptos" w:cs="Times New Roman"/>
-          <w:b/>
-          <w:bCs/>
-        </w:rPr>
-        <w:t>.</w:t>
-      </w:r>
-    </w:p>
-    <w:p>
-      <w:pPr>
-        <w:pStyle w:val="Paragraphedeliste"/>
-        <w:numPr>
-          <w:ilvl w:val="0"/>
-          <w:numId w:val="20"/>
-        </w:numPr>
-        <w:spacing w:after="0"/>
-        <w:rPr>
-          <w:rFonts w:ascii="Aptos" w:hAnsi="Aptos" w:cs="Times New Roman"/>
-          <w:b/>
-          <w:bCs/>
-        </w:rPr>
-      </w:pPr>
-      <w:r>
-        <w:rPr>
-          <w:rFonts w:ascii="Aptos" w:hAnsi="Aptos" w:cs="Times New Roman"/>
-          <w:b/>
-          <w:bCs/>
-        </w:rPr>
-        <w:t>{{ACTIVITY</w:t>
-      </w:r>
-      <w:r>
-        <w:rPr>
-          <w:rFonts w:ascii="Aptos" w:hAnsi="Aptos" w:cs="Times New Roman"/>
-          <w:b/>
-          <w:bCs/>
-        </w:rPr>
-        <w:t>3</w:t>
-      </w:r>
-      <w:r>
-        <w:rPr>
-          <w:rFonts w:ascii="Aptos" w:hAnsi="Aptos" w:cs="Times New Roman"/>
-          <w:b/>
-          <w:bCs/>
-        </w:rPr>
-        <w:t>}}</w:t>
-      </w:r>
-      <w:r>
-        <w:rPr>
-          <w:rFonts w:ascii="Aptos" w:hAnsi="Aptos" w:cs="Times New Roman"/>
-          <w:b/>
-          <w:bCs/>
-        </w:rPr>
-        <w:t>.</w:t>
-      </w:r>
-    </w:p>
-    <w:p>
-      <w:pPr>
-        <w:pStyle w:val="Paragraphedeliste"/>
-        <w:numPr>
-          <w:ilvl w:val="0"/>
-          <w:numId w:val="20"/>
-        </w:numPr>
-        <w:spacing w:after="0"/>
-        <w:rPr>
-          <w:rFonts w:ascii="Aptos" w:hAnsi="Aptos" w:cs="Times New Roman"/>
-          <w:b/>
-          <w:bCs/>
-        </w:rPr>
-      </w:pPr>
-      <w:r>
-        <w:rPr>
-          <w:rFonts w:ascii="Aptos" w:hAnsi="Aptos" w:cs="Times New Roman"/>
-          <w:b/>
-          <w:bCs/>
-        </w:rPr>
-        <w:t>{{ACTIVITY</w:t>
-      </w:r>
-      <w:r>
-        <w:rPr>
-          <w:rFonts w:ascii="Aptos" w:hAnsi="Aptos" w:cs="Times New Roman"/>
-          <w:b/>
-          <w:bCs/>
-        </w:rPr>
-        <w:t>4</w:t>
-      </w:r>
-      <w:r>
-        <w:rPr>
-          <w:rFonts w:ascii="Aptos" w:hAnsi="Aptos" w:cs="Times New Roman"/>
-          <w:b/>
-          <w:bCs/>
-        </w:rPr>
-        <w:t>}}</w:t>
-      </w:r>
-      <w:r>
-        <w:rPr>
-          <w:rFonts w:ascii="Aptos" w:hAnsi="Aptos" w:cs="Times New Roman"/>
-          <w:b/>
-          <w:bCs/>
-        </w:rPr>
-        <w:t>.</w:t>
-      </w:r>
-    </w:p>
-    <w:p>
-      <w:pPr>
-        <w:pStyle w:val="Paragraphedeliste"/>
-        <w:numPr>
-          <w:ilvl w:val="0"/>
-          <w:numId w:val="20"/>
-        </w:numPr>
-        <w:spacing w:after="0"/>
-        <w:rPr>
-          <w:rFonts w:ascii="Aptos" w:hAnsi="Aptos" w:cs="Times New Roman"/>
-          <w:b/>
-          <w:bCs/>
-        </w:rPr>
-      </w:pPr>
-      <w:r>
-        <w:rPr>
-          <w:rFonts w:ascii="Aptos" w:hAnsi="Aptos" w:cs="Times New Roman"/>
-          <w:b/>
-          <w:bCs/>
-        </w:rPr>
-        <w:t>{{ACTIVITY</w:t>
-      </w:r>
-      <w:r>
-        <w:rPr>
-          <w:rFonts w:ascii="Aptos" w:hAnsi="Aptos" w:cs="Times New Roman"/>
-          <w:b/>
-          <w:bCs/>
-        </w:rPr>
-        <w:t>5</w:t>
-      </w:r>
-      <w:r>
-        <w:rPr>
-          <w:rFonts w:ascii="Aptos" w:hAnsi="Aptos" w:cs="Times New Roman"/>
-          <w:b/>
-          <w:bCs/>
-        </w:rPr>
-        <w:t>}}</w:t>
-      </w:r>
-      <w:r>
-        <w:rPr>
-          <w:rFonts w:ascii="Aptos" w:hAnsi="Aptos" w:cs="Times New Roman"/>
-          <w:b/>
-          <w:bCs/>
-        </w:rPr>
-        <w:t>.</w:t>
-      </w:r>
-    </w:p>
-    <w:p>
-      <w:pPr>
-        <w:pStyle w:val="Paragraphedeliste"/>
-        <w:numPr>
-          <w:ilvl w:val="0"/>
-          <w:numId w:val="20"/>
-        </w:numPr>
-        <w:spacing w:after="0"/>
-        <w:rPr>
-          <w:rFonts w:ascii="Aptos" w:hAnsi="Aptos" w:cs="Times New Roman"/>
-          <w:b/>
-          <w:bCs/>
-        </w:rPr>
-      </w:pPr>
-      <w:r>
-        <w:rPr>
-          <w:rFonts w:ascii="Aptos" w:hAnsi="Aptos" w:cs="Times New Roman"/>
-          <w:b/>
-          <w:bCs/>
-        </w:rPr>
-        <w:t>{{ACTIVITY</w:t>
-      </w:r>
-      <w:r>
-        <w:rPr>
-          <w:rFonts w:ascii="Aptos" w:hAnsi="Aptos" w:cs="Times New Roman"/>
-          <w:b/>
-          <w:bCs/>
-        </w:rPr>
-        <w:t>6</w:t>
-      </w:r>
-      <w:r>
-        <w:rPr>
-          <w:rFonts w:ascii="Aptos" w:hAnsi="Aptos" w:cs="Times New Roman"/>
-          <w:b/>
-          <w:bCs/>
-        </w:rPr>
-        <w:t>}}</w:t>
-      </w:r>
-      <w:r>
-        <w:rPr>
-          <w:rFonts w:ascii="Aptos" w:hAnsi="Aptos" w:cs="Times New Roman"/>
-          <w:b/>
-          <w:bCs/>
-        </w:rPr>
-        <w:t>.</w:t>
+        <w:t xml:space="preserve"> %}</w:t>
       </w:r>
     </w:p>
     <w:bookmarkEnd w:id="9"/>
@@ -1571,7 +1405,6 @@
         <w:rPr>
           <w:rFonts w:ascii="Aptos" w:hAnsi="Aptos" w:cs="Times New Roman"/>
         </w:rPr>
-        <w:lastRenderedPageBreak/>
         <w:t>Il pourra être transféré en tout autre endroit au Maroc en vertu d’une décision</w:t>
       </w:r>
       <w:r>
@@ -1616,6 +1449,7 @@
           <w:b/>
           <w:u w:val="single"/>
         </w:rPr>
+        <w:lastRenderedPageBreak/>
         <w:t>ARTICLE 5- DUREE</w:t>
       </w:r>
     </w:p>
@@ -3025,7 +2859,7 @@
           <w:sz w:val="22"/>
           <w:szCs w:val="22"/>
         </w:rPr>
-        <w:t xml:space="preserve"> peine de nullité du contrat, il est interdit aux gérants et aux représentants légaux des associés personnes morales, de contracter, sous quelque forme que ce soit, des emprunts auprès de la société, de se faire consentir par elle un découvert en compte courant ou autrement, ainsi que de faire cautionner ou avaliser par </w:t>
+        <w:t xml:space="preserve"> peine de nullité du contrat, il est interdit aux gérants et aux représentants légaux des associés personnes </w:t>
       </w:r>
       <w:r>
         <w:rPr>
@@ -3034,7 +2868,7 @@
           <w:szCs w:val="22"/>
         </w:rPr>
         <w:lastRenderedPageBreak/>
-        <w:t>elle ses engagements envers les tiers.</w:t>
+        <w:t>morales, de contracter, sous quelque forme que ce soit, des emprunts auprès de la société, de se faire consentir par elle un découvert en compte courant ou autrement, ainsi que de faire cautionner ou avaliser par elle ses engagements envers les tiers.</w:t>
       </w:r>
     </w:p>
     <w:p>
@@ -3774,6 +3608,7 @@
           <w:sz w:val="22"/>
           <w:szCs w:val="22"/>
         </w:rPr>
+        <w:lastRenderedPageBreak/>
         <w:t>Les associés approuvent les comptes, le cas échéant, après rapport du commissaire aux comptes dans le délai de six mois à compter de la clôture de l’exercice.</w:t>
       </w:r>
     </w:p>
@@ -4486,7 +4321,6 @@
           <w:sz w:val="22"/>
           <w:szCs w:val="22"/>
         </w:rPr>
-        <w:lastRenderedPageBreak/>
         <w:t>TITRE SEPTIEME</w:t>
       </w:r>
     </w:p>
@@ -4891,7 +4725,7 @@
 </file>
 
 <file path=word/endnotes.xml><?xml version="1.0" encoding="utf-8"?>
-<w:endnotes xmlns:wpc="http://schemas.microsoft.com/office/word/2010/wordprocessingCanvas" xmlns:cx="http://schemas.microsoft.com/office/drawing/2014/chartex" xmlns:cx1="http://schemas.microsoft.com/office/drawing/2015/9/8/chartex" xmlns:cx2="http://schemas.microsoft.com/office/drawing/2015/10/21/chartex" xmlns:cx3="http://schemas.microsoft.com/office/drawing/2016/5/9/chartex" xmlns:cx4="http://schemas.microsoft.com/office/drawing/2016/5/10/chartex" xmlns:cx5="http://schemas.microsoft.com/office/drawing/2016/5/11/chartex" xmlns:cx6="http://schemas.microsoft.com/office/drawing/2016/5/12/chartex" xmlns:cx7="http://schemas.microsoft.com/office/drawing/2016/5/13/chartex" xmlns:cx8="http://schemas.microsoft.com/office/drawing/2016/5/14/chartex" xmlns:mc="http://schemas.openxmlformats.org/markup-compatibility/2006" xmlns:aink="http://schemas.microsoft.com/office/drawing/2016/ink" xmlns:am3d="http://schemas.microsoft.com/office/drawing/2017/model3d" xmlns:o="urn:schemas-microsoft-com:office:office" xmlns:oel="http://schemas.microsoft.com/office/2019/extlst" xmlns:r="http://schemas.openxmlformats.org/officeDocument/2006/relationships" xmlns:m="http://schemas.openxmlformats.org/officeDocument/2006/math" xmlns:v="urn:schemas-microsoft-com:vml" xmlns:wp14="http://schemas.microsoft.com/office/word/2010/wordprocessingDrawing" xmlns:wp="http://schemas.openxmlformats.org/drawingml/2006/wordprocessingDrawing" xmlns:w10="urn:schemas-microsoft-com:office:word" xmlns:w="http://schemas.openxmlformats.org/wordprocessingml/2006/main" xmlns:w14="http://schemas.microsoft.com/office/word/2010/wordml" xmlns:w15="http://schemas.microsoft.com/office/word/2012/wordml" xmlns:w16cex="http://schemas.microsoft.com/office/word/2018/wordml/cex" xmlns:w16cid="http://schemas.microsoft.com/office/word/2016/wordml/cid" xmlns:w16="http://schemas.microsoft.com/office/word/2018/wordml" xmlns:w16sdtdh="http://schemas.microsoft.com/office/word/2020/wordml/sdtdatahash" xmlns:w16se="http://schemas.microsoft.com/office/word/2015/wordml/symex" xmlns:wpg="http://schemas.microsoft.com/office/word/2010/wordprocessingGroup" xmlns:wpi="http://schemas.microsoft.com/office/word/2010/wordprocessingInk" xmlns:wne="http://schemas.microsoft.com/office/word/2006/wordml" xmlns:wps="http://schemas.microsoft.com/office/word/2010/wordprocessingShape" mc:Ignorable="w14 w15 w16se w16cid w16 w16cex w16sdtdh wp14">
+<w:endnotes xmlns:wpc="http://schemas.microsoft.com/office/word/2010/wordprocessingCanvas" xmlns:cx="http://schemas.microsoft.com/office/drawing/2014/chartex" xmlns:cx1="http://schemas.microsoft.com/office/drawing/2015/9/8/chartex" xmlns:cx2="http://schemas.microsoft.com/office/drawing/2015/10/21/chartex" xmlns:cx3="http://schemas.microsoft.com/office/drawing/2016/5/9/chartex" xmlns:cx4="http://schemas.microsoft.com/office/drawing/2016/5/10/chartex" xmlns:cx5="http://schemas.microsoft.com/office/drawing/2016/5/11/chartex" xmlns:cx6="http://schemas.microsoft.com/office/drawing/2016/5/12/chartex" xmlns:cx7="http://schemas.microsoft.com/office/drawing/2016/5/13/chartex" xmlns:cx8="http://schemas.microsoft.com/office/drawing/2016/5/14/chartex" xmlns:mc="http://schemas.openxmlformats.org/markup-compatibility/2006" xmlns:aink="http://schemas.microsoft.com/office/drawing/2016/ink" xmlns:am3d="http://schemas.microsoft.com/office/drawing/2017/model3d" xmlns:o="urn:schemas-microsoft-com:office:office" xmlns:oel="http://schemas.microsoft.com/office/2019/extlst" xmlns:r="http://schemas.openxmlformats.org/officeDocument/2006/relationships" xmlns:m="http://schemas.openxmlformats.org/officeDocument/2006/math" xmlns:v="urn:schemas-microsoft-com:vml" xmlns:wp14="http://schemas.microsoft.com/office/word/2010/wordprocessingDrawing" xmlns:wp="http://schemas.openxmlformats.org/drawingml/2006/wordprocessingDrawing" xmlns:w10="urn:schemas-microsoft-com:office:word" xmlns:w="http://schemas.openxmlformats.org/wordprocessingml/2006/main" xmlns:w14="http://schemas.microsoft.com/office/word/2010/wordml" xmlns:w15="http://schemas.microsoft.com/office/word/2012/wordml" xmlns:w16cex="http://schemas.microsoft.com/office/word/2018/wordml/cex" xmlns:w16cid="http://schemas.microsoft.com/office/word/2016/wordml/cid" xmlns:w16="http://schemas.microsoft.com/office/word/2018/wordml" xmlns:w16du="http://schemas.microsoft.com/office/word/2023/wordml/word16du" xmlns:w16sdtdh="http://schemas.microsoft.com/office/word/2020/wordml/sdtdatahash" xmlns:w16sdtfl="http://schemas.microsoft.com/office/word/2024/wordml/sdtformatlock" xmlns:w16se="http://schemas.microsoft.com/office/word/2015/wordml/symex" xmlns:wpg="http://schemas.microsoft.com/office/word/2010/wordprocessingGroup" xmlns:wpi="http://schemas.microsoft.com/office/word/2010/wordprocessingInk" xmlns:wne="http://schemas.microsoft.com/office/word/2006/wordml" xmlns:wps="http://schemas.microsoft.com/office/word/2010/wordprocessingShape" mc:Ignorable="w14 w15 w16se w16cid w16 w16cex w16sdtdh w16sdtfl w16du wp14">
   <w:endnote w:type="separator" w:id="-1">
     <w:p>
       <w:pPr>
@@ -4916,7 +4750,7 @@
 </file>
 
 <file path=word/footer1.xml><?xml version="1.0" encoding="utf-8"?>
-<w:ftr xmlns:wpc="http://schemas.microsoft.com/office/word/2010/wordprocessingCanvas" xmlns:cx="http://schemas.microsoft.com/office/drawing/2014/chartex" xmlns:cx1="http://schemas.microsoft.com/office/drawing/2015/9/8/chartex" xmlns:cx2="http://schemas.microsoft.com/office/drawing/2015/10/21/chartex" xmlns:cx3="http://schemas.microsoft.com/office/drawing/2016/5/9/chartex" xmlns:cx4="http://schemas.microsoft.com/office/drawing/2016/5/10/chartex" xmlns:cx5="http://schemas.microsoft.com/office/drawing/2016/5/11/chartex" xmlns:cx6="http://schemas.microsoft.com/office/drawing/2016/5/12/chartex" xmlns:cx7="http://schemas.microsoft.com/office/drawing/2016/5/13/chartex" xmlns:cx8="http://schemas.microsoft.com/office/drawing/2016/5/14/chartex" xmlns:mc="http://schemas.openxmlformats.org/markup-compatibility/2006" xmlns:aink="http://schemas.microsoft.com/office/drawing/2016/ink" xmlns:am3d="http://schemas.microsoft.com/office/drawing/2017/model3d" xmlns:o="urn:schemas-microsoft-com:office:office" xmlns:oel="http://schemas.microsoft.com/office/2019/extlst" xmlns:r="http://schemas.openxmlformats.org/officeDocument/2006/relationships" xmlns:m="http://schemas.openxmlformats.org/officeDocument/2006/math" xmlns:v="urn:schemas-microsoft-com:vml" xmlns:wp14="http://schemas.microsoft.com/office/word/2010/wordprocessingDrawing" xmlns:wp="http://schemas.openxmlformats.org/drawingml/2006/wordprocessingDrawing" xmlns:w10="urn:schemas-microsoft-com:office:word" xmlns:w="http://schemas.openxmlformats.org/wordprocessingml/2006/main" xmlns:w14="http://schemas.microsoft.com/office/word/2010/wordml" xmlns:w15="http://schemas.microsoft.com/office/word/2012/wordml" xmlns:w16cex="http://schemas.microsoft.com/office/word/2018/wordml/cex" xmlns:w16cid="http://schemas.microsoft.com/office/word/2016/wordml/cid" xmlns:w16="http://schemas.microsoft.com/office/word/2018/wordml" xmlns:w16sdtdh="http://schemas.microsoft.com/office/word/2020/wordml/sdtdatahash" xmlns:w16se="http://schemas.microsoft.com/office/word/2015/wordml/symex" xmlns:wpg="http://schemas.microsoft.com/office/word/2010/wordprocessingGroup" xmlns:wpi="http://schemas.microsoft.com/office/word/2010/wordprocessingInk" xmlns:wne="http://schemas.microsoft.com/office/word/2006/wordml" xmlns:wps="http://schemas.microsoft.com/office/word/2010/wordprocessingShape" mc:Ignorable="w14 w15 w16se w16cid w16 w16cex w16sdtdh wp14">
+<w:ftr xmlns:wpc="http://schemas.microsoft.com/office/word/2010/wordprocessingCanvas" xmlns:cx="http://schemas.microsoft.com/office/drawing/2014/chartex" xmlns:cx1="http://schemas.microsoft.com/office/drawing/2015/9/8/chartex" xmlns:cx2="http://schemas.microsoft.com/office/drawing/2015/10/21/chartex" xmlns:cx3="http://schemas.microsoft.com/office/drawing/2016/5/9/chartex" xmlns:cx4="http://schemas.microsoft.com/office/drawing/2016/5/10/chartex" xmlns:cx5="http://schemas.microsoft.com/office/drawing/2016/5/11/chartex" xmlns:cx6="http://schemas.microsoft.com/office/drawing/2016/5/12/chartex" xmlns:cx7="http://schemas.microsoft.com/office/drawing/2016/5/13/chartex" xmlns:cx8="http://schemas.microsoft.com/office/drawing/2016/5/14/chartex" xmlns:mc="http://schemas.openxmlformats.org/markup-compatibility/2006" xmlns:aink="http://schemas.microsoft.com/office/drawing/2016/ink" xmlns:am3d="http://schemas.microsoft.com/office/drawing/2017/model3d" xmlns:o="urn:schemas-microsoft-com:office:office" xmlns:oel="http://schemas.microsoft.com/office/2019/extlst" xmlns:r="http://schemas.openxmlformats.org/officeDocument/2006/relationships" xmlns:m="http://schemas.openxmlformats.org/officeDocument/2006/math" xmlns:v="urn:schemas-microsoft-com:vml" xmlns:wp14="http://schemas.microsoft.com/office/word/2010/wordprocessingDrawing" xmlns:wp="http://schemas.openxmlformats.org/drawingml/2006/wordprocessingDrawing" xmlns:w10="urn:schemas-microsoft-com:office:word" xmlns:w="http://schemas.openxmlformats.org/wordprocessingml/2006/main" xmlns:w14="http://schemas.microsoft.com/office/word/2010/wordml" xmlns:w15="http://schemas.microsoft.com/office/word/2012/wordml" xmlns:w16cex="http://schemas.microsoft.com/office/word/2018/wordml/cex" xmlns:w16cid="http://schemas.microsoft.com/office/word/2016/wordml/cid" xmlns:w16="http://schemas.microsoft.com/office/word/2018/wordml" xmlns:w16du="http://schemas.microsoft.com/office/word/2023/wordml/word16du" xmlns:w16sdtdh="http://schemas.microsoft.com/office/word/2020/wordml/sdtdatahash" xmlns:w16sdtfl="http://schemas.microsoft.com/office/word/2024/wordml/sdtformatlock" xmlns:w16se="http://schemas.microsoft.com/office/word/2015/wordml/symex" xmlns:wpg="http://schemas.microsoft.com/office/word/2010/wordprocessingGroup" xmlns:wpi="http://schemas.microsoft.com/office/word/2010/wordprocessingInk" xmlns:wne="http://schemas.microsoft.com/office/word/2006/wordml" xmlns:wps="http://schemas.microsoft.com/office/word/2010/wordprocessingShape" mc:Ignorable="w14 w15 w16se w16cid w16 w16cex w16sdtdh w16sdtfl w16du wp14">
   <w:sdt>
     <w:sdtPr>
       <w:id w:val="276332450"/>
@@ -5038,7 +4872,7 @@
 </file>
 
 <file path=word/footnotes.xml><?xml version="1.0" encoding="utf-8"?>
-<w:footnotes xmlns:wpc="http://schemas.microsoft.com/office/word/2010/wordprocessingCanvas" xmlns:cx="http://schemas.microsoft.com/office/drawing/2014/chartex" xmlns:cx1="http://schemas.microsoft.com/office/drawing/2015/9/8/chartex" xmlns:cx2="http://schemas.microsoft.com/office/drawing/2015/10/21/chartex" xmlns:cx3="http://schemas.microsoft.com/office/drawing/2016/5/9/chartex" xmlns:cx4="http://schemas.microsoft.com/office/drawing/2016/5/10/chartex" xmlns:cx5="http://schemas.microsoft.com/office/drawing/2016/5/11/chartex" xmlns:cx6="http://schemas.microsoft.com/office/drawing/2016/5/12/chartex" xmlns:cx7="http://schemas.microsoft.com/office/drawing/2016/5/13/chartex" xmlns:cx8="http://schemas.microsoft.com/office/drawing/2016/5/14/chartex" xmlns:mc="http://schemas.openxmlformats.org/markup-compatibility/2006" xmlns:aink="http://schemas.microsoft.com/office/drawing/2016/ink" xmlns:am3d="http://schemas.microsoft.com/office/drawing/2017/model3d" xmlns:o="urn:schemas-microsoft-com:office:office" xmlns:oel="http://schemas.microsoft.com/office/2019/extlst" xmlns:r="http://schemas.openxmlformats.org/officeDocument/2006/relationships" xmlns:m="http://schemas.openxmlformats.org/officeDocument/2006/math" xmlns:v="urn:schemas-microsoft-com:vml" xmlns:wp14="http://schemas.microsoft.com/office/word/2010/wordprocessingDrawing" xmlns:wp="http://schemas.openxmlformats.org/drawingml/2006/wordprocessingDrawing" xmlns:w10="urn:schemas-microsoft-com:office:word" xmlns:w="http://schemas.openxmlformats.org/wordprocessingml/2006/main" xmlns:w14="http://schemas.microsoft.com/office/word/2010/wordml" xmlns:w15="http://schemas.microsoft.com/office/word/2012/wordml" xmlns:w16cex="http://schemas.microsoft.com/office/word/2018/wordml/cex" xmlns:w16cid="http://schemas.microsoft.com/office/word/2016/wordml/cid" xmlns:w16="http://schemas.microsoft.com/office/word/2018/wordml" xmlns:w16sdtdh="http://schemas.microsoft.com/office/word/2020/wordml/sdtdatahash" xmlns:w16se="http://schemas.microsoft.com/office/word/2015/wordml/symex" xmlns:wpg="http://schemas.microsoft.com/office/word/2010/wordprocessingGroup" xmlns:wpi="http://schemas.microsoft.com/office/word/2010/wordprocessingInk" xmlns:wne="http://schemas.microsoft.com/office/word/2006/wordml" xmlns:wps="http://schemas.microsoft.com/office/word/2010/wordprocessingShape" mc:Ignorable="w14 w15 w16se w16cid w16 w16cex w16sdtdh wp14">
+<w:footnotes xmlns:wpc="http://schemas.microsoft.com/office/word/2010/wordprocessingCanvas" xmlns:cx="http://schemas.microsoft.com/office/drawing/2014/chartex" xmlns:cx1="http://schemas.microsoft.com/office/drawing/2015/9/8/chartex" xmlns:cx2="http://schemas.microsoft.com/office/drawing/2015/10/21/chartex" xmlns:cx3="http://schemas.microsoft.com/office/drawing/2016/5/9/chartex" xmlns:cx4="http://schemas.microsoft.com/office/drawing/2016/5/10/chartex" xmlns:cx5="http://schemas.microsoft.com/office/drawing/2016/5/11/chartex" xmlns:cx6="http://schemas.microsoft.com/office/drawing/2016/5/12/chartex" xmlns:cx7="http://schemas.microsoft.com/office/drawing/2016/5/13/chartex" xmlns:cx8="http://schemas.microsoft.com/office/drawing/2016/5/14/chartex" xmlns:mc="http://schemas.openxmlformats.org/markup-compatibility/2006" xmlns:aink="http://schemas.microsoft.com/office/drawing/2016/ink" xmlns:am3d="http://schemas.microsoft.com/office/drawing/2017/model3d" xmlns:o="urn:schemas-microsoft-com:office:office" xmlns:oel="http://schemas.microsoft.com/office/2019/extlst" xmlns:r="http://schemas.openxmlformats.org/officeDocument/2006/relationships" xmlns:m="http://schemas.openxmlformats.org/officeDocument/2006/math" xmlns:v="urn:schemas-microsoft-com:vml" xmlns:wp14="http://schemas.microsoft.com/office/word/2010/wordprocessingDrawing" xmlns:wp="http://schemas.openxmlformats.org/drawingml/2006/wordprocessingDrawing" xmlns:w10="urn:schemas-microsoft-com:office:word" xmlns:w="http://schemas.openxmlformats.org/wordprocessingml/2006/main" xmlns:w14="http://schemas.microsoft.com/office/word/2010/wordml" xmlns:w15="http://schemas.microsoft.com/office/word/2012/wordml" xmlns:w16cex="http://schemas.microsoft.com/office/word/2018/wordml/cex" xmlns:w16cid="http://schemas.microsoft.com/office/word/2016/wordml/cid" xmlns:w16="http://schemas.microsoft.com/office/word/2018/wordml" xmlns:w16du="http://schemas.microsoft.com/office/word/2023/wordml/word16du" xmlns:w16sdtdh="http://schemas.microsoft.com/office/word/2020/wordml/sdtdatahash" xmlns:w16sdtfl="http://schemas.microsoft.com/office/word/2024/wordml/sdtformatlock" xmlns:w16se="http://schemas.microsoft.com/office/word/2015/wordml/symex" xmlns:wpg="http://schemas.microsoft.com/office/word/2010/wordprocessingGroup" xmlns:wpi="http://schemas.microsoft.com/office/word/2010/wordprocessingInk" xmlns:wne="http://schemas.microsoft.com/office/word/2006/wordml" xmlns:wps="http://schemas.microsoft.com/office/word/2010/wordprocessingShape" mc:Ignorable="w14 w15 w16se w16cid w16 w16cex w16sdtdh w16sdtfl w16du wp14">
   <w:footnote w:type="separator" w:id="-1">
     <w:p>
       <w:pPr>
@@ -5063,7 +4897,7 @@
 </file>
 
 <file path=word/numbering.xml><?xml version="1.0" encoding="utf-8"?>
-<w:numbering xmlns:wpc="http://schemas.microsoft.com/office/word/2010/wordprocessingCanvas" xmlns:cx="http://schemas.microsoft.com/office/drawing/2014/chartex" xmlns:cx1="http://schemas.microsoft.com/office/drawing/2015/9/8/chartex" xmlns:cx2="http://schemas.microsoft.com/office/drawing/2015/10/21/chartex" xmlns:cx3="http://schemas.microsoft.com/office/drawing/2016/5/9/chartex" xmlns:cx4="http://schemas.microsoft.com/office/drawing/2016/5/10/chartex" xmlns:cx5="http://schemas.microsoft.com/office/drawing/2016/5/11/chartex" xmlns:cx6="http://schemas.microsoft.com/office/drawing/2016/5/12/chartex" xmlns:cx7="http://schemas.microsoft.com/office/drawing/2016/5/13/chartex" xmlns:cx8="http://schemas.microsoft.com/office/drawing/2016/5/14/chartex" xmlns:mc="http://schemas.openxmlformats.org/markup-compatibility/2006" xmlns:aink="http://schemas.microsoft.com/office/drawing/2016/ink" xmlns:am3d="http://schemas.microsoft.com/office/drawing/2017/model3d" xmlns:o="urn:schemas-microsoft-com:office:office" xmlns:oel="http://schemas.microsoft.com/office/2019/extlst" xmlns:r="http://schemas.openxmlformats.org/officeDocument/2006/relationships" xmlns:m="http://schemas.openxmlformats.org/officeDocument/2006/math" xmlns:v="urn:schemas-microsoft-com:vml" xmlns:wp14="http://schemas.microsoft.com/office/word/2010/wordprocessingDrawing" xmlns:wp="http://schemas.openxmlformats.org/drawingml/2006/wordprocessingDrawing" xmlns:w10="urn:schemas-microsoft-com:office:word" xmlns:w="http://schemas.openxmlformats.org/wordprocessingml/2006/main" xmlns:w14="http://schemas.microsoft.com/office/word/2010/wordml" xmlns:w15="http://schemas.microsoft.com/office/word/2012/wordml" xmlns:w16cex="http://schemas.microsoft.com/office/word/2018/wordml/cex" xmlns:w16cid="http://schemas.microsoft.com/office/word/2016/wordml/cid" xmlns:w16="http://schemas.microsoft.com/office/word/2018/wordml" xmlns:w16sdtdh="http://schemas.microsoft.com/office/word/2020/wordml/sdtdatahash" xmlns:w16se="http://schemas.microsoft.com/office/word/2015/wordml/symex" xmlns:wpg="http://schemas.microsoft.com/office/word/2010/wordprocessingGroup" xmlns:wpi="http://schemas.microsoft.com/office/word/2010/wordprocessingInk" xmlns:wne="http://schemas.microsoft.com/office/word/2006/wordml" xmlns:wps="http://schemas.microsoft.com/office/word/2010/wordprocessingShape" mc:Ignorable="w14 w15 w16se w16cid w16 w16cex w16sdtdh wp14">
+<w:numbering xmlns:wpc="http://schemas.microsoft.com/office/word/2010/wordprocessingCanvas" xmlns:cx="http://schemas.microsoft.com/office/drawing/2014/chartex" xmlns:cx1="http://schemas.microsoft.com/office/drawing/2015/9/8/chartex" xmlns:cx2="http://schemas.microsoft.com/office/drawing/2015/10/21/chartex" xmlns:cx3="http://schemas.microsoft.com/office/drawing/2016/5/9/chartex" xmlns:cx4="http://schemas.microsoft.com/office/drawing/2016/5/10/chartex" xmlns:cx5="http://schemas.microsoft.com/office/drawing/2016/5/11/chartex" xmlns:cx6="http://schemas.microsoft.com/office/drawing/2016/5/12/chartex" xmlns:cx7="http://schemas.microsoft.com/office/drawing/2016/5/13/chartex" xmlns:cx8="http://schemas.microsoft.com/office/drawing/2016/5/14/chartex" xmlns:mc="http://schemas.openxmlformats.org/markup-compatibility/2006" xmlns:aink="http://schemas.microsoft.com/office/drawing/2016/ink" xmlns:am3d="http://schemas.microsoft.com/office/drawing/2017/model3d" xmlns:o="urn:schemas-microsoft-com:office:office" xmlns:oel="http://schemas.microsoft.com/office/2019/extlst" xmlns:r="http://schemas.openxmlformats.org/officeDocument/2006/relationships" xmlns:m="http://schemas.openxmlformats.org/officeDocument/2006/math" xmlns:v="urn:schemas-microsoft-com:vml" xmlns:wp14="http://schemas.microsoft.com/office/word/2010/wordprocessingDrawing" xmlns:wp="http://schemas.openxmlformats.org/drawingml/2006/wordprocessingDrawing" xmlns:w10="urn:schemas-microsoft-com:office:word" xmlns:w="http://schemas.openxmlformats.org/wordprocessingml/2006/main" xmlns:w14="http://schemas.microsoft.com/office/word/2010/wordml" xmlns:w15="http://schemas.microsoft.com/office/word/2012/wordml" xmlns:w16cex="http://schemas.microsoft.com/office/word/2018/wordml/cex" xmlns:w16cid="http://schemas.microsoft.com/office/word/2016/wordml/cid" xmlns:w16="http://schemas.microsoft.com/office/word/2018/wordml" xmlns:w16du="http://schemas.microsoft.com/office/word/2023/wordml/word16du" xmlns:w16sdtdh="http://schemas.microsoft.com/office/word/2020/wordml/sdtdatahash" xmlns:w16sdtfl="http://schemas.microsoft.com/office/word/2024/wordml/sdtformatlock" xmlns:w16se="http://schemas.microsoft.com/office/word/2015/wordml/symex" xmlns:wpg="http://schemas.microsoft.com/office/word/2010/wordprocessingGroup" xmlns:wpi="http://schemas.microsoft.com/office/word/2010/wordprocessingInk" xmlns:wne="http://schemas.microsoft.com/office/word/2006/wordml" xmlns:wps="http://schemas.microsoft.com/office/word/2010/wordprocessingShape" mc:Ignorable="w14 w15 w16se w16cid w16 w16cex w16sdtdh w16sdtfl w16du wp14">
   <w:numPicBullet w:numPicBulletId="0">
     <w:pict>
       <v:shapetype id="_x0000_t75" coordsize="21600,21600" o:spt="75" o:preferrelative="t" path="m@4@5l@4@11@9@11@9@5xe" filled="f" stroked="f">
@@ -5085,7 +4919,7 @@
         <v:path o:extrusionok="f" gradientshapeok="t" o:connecttype="rect"/>
         <o:lock v:ext="edit" aspectratio="t"/>
       </v:shapetype>
-      <v:shape id="_x0000_i1029" type="#_x0000_t75" style="width:11.25pt;height:11.25pt" o:bullet="t">
+      <v:shape id="_x0000_i1025" type="#_x0000_t75" style="width:11.1pt;height:11.1pt" o:bullet="t">
         <v:imagedata r:id="rId1" o:title="msoFA43"/>
       </v:shape>
     </w:pict>
@@ -7108,7 +6942,7 @@
 </file>
 
 <file path=word/styles.xml><?xml version="1.0" encoding="utf-8"?>
-<w:styles xmlns:mc="http://schemas.openxmlformats.org/markup-compatibility/2006" xmlns:r="http://schemas.openxmlformats.org/officeDocument/2006/relationships" xmlns:w="http://schemas.openxmlformats.org/wordprocessingml/2006/main" xmlns:w14="http://schemas.microsoft.com/office/word/2010/wordml" xmlns:w15="http://schemas.microsoft.com/office/word/2012/wordml" xmlns:w16cex="http://schemas.microsoft.com/office/word/2018/wordml/cex" xmlns:w16cid="http://schemas.microsoft.com/office/word/2016/wordml/cid" xmlns:w16="http://schemas.microsoft.com/office/word/2018/wordml" xmlns:w16sdtdh="http://schemas.microsoft.com/office/word/2020/wordml/sdtdatahash" xmlns:w16se="http://schemas.microsoft.com/office/word/2015/wordml/symex" mc:Ignorable="w14 w15 w16se w16cid w16 w16cex w16sdtdh">
+<w:styles xmlns:mc="http://schemas.openxmlformats.org/markup-compatibility/2006" xmlns:r="http://schemas.openxmlformats.org/officeDocument/2006/relationships" xmlns:w="http://schemas.openxmlformats.org/wordprocessingml/2006/main" xmlns:w14="http://schemas.microsoft.com/office/word/2010/wordml" xmlns:w15="http://schemas.microsoft.com/office/word/2012/wordml" xmlns:w16cex="http://schemas.microsoft.com/office/word/2018/wordml/cex" xmlns:w16cid="http://schemas.microsoft.com/office/word/2016/wordml/cid" xmlns:w16="http://schemas.microsoft.com/office/word/2018/wordml" xmlns:w16du="http://schemas.microsoft.com/office/word/2023/wordml/word16du" xmlns:w16sdtdh="http://schemas.microsoft.com/office/word/2020/wordml/sdtdatahash" xmlns:w16sdtfl="http://schemas.microsoft.com/office/word/2024/wordml/sdtformatlock" xmlns:w16se="http://schemas.microsoft.com/office/word/2015/wordml/symex" mc:Ignorable="w14 w15 w16se w16cid w16 w16cex w16sdtdh w16sdtfl w16du">
   <w:docDefaults>
     <w:rPrDefault>
       <w:rPr>

</xml_diff>